<commit_message>
Corrección del documento Planilla CU VitalSY
</commit_message>
<xml_diff>
--- a/Documentación/Planilla CU VitalSY.docx
+++ b/Documentación/Planilla CU VitalSY.docx
@@ -3194,6 +3194,7 @@
             </w:pPr>
             <w:proofErr w:type="spellStart"/>
             <w:r>
+              <w:lastRenderedPageBreak/>
               <w:t>Prioridad</w:t>
             </w:r>
             <w:proofErr w:type="spellEnd"/>
@@ -4260,6 +4261,7 @@
               </w:rPr>
             </w:pPr>
             <w:r>
+              <w:lastRenderedPageBreak/>
               <w:t>2</w:t>
             </w:r>
           </w:p>
@@ -4309,7 +4311,6 @@
               </w:rPr>
             </w:pPr>
             <w:r>
-              <w:lastRenderedPageBreak/>
               <w:t>3</w:t>
             </w:r>
           </w:p>
@@ -5430,24 +5431,32 @@
               <w:rPr>
                 <w:lang w:val="es-ES"/>
               </w:rPr>
-              <w:t>Permite registrar las comidas consumidas detallando los carbohidratos netos (gramos) ingeridos, notas del alimento y el momento de la ingesta para evaluar el impacto en la glucosa.</w:t>
-            </w:r>
-          </w:p>
-        </w:tc>
-      </w:tr>
-      <w:tr>
-        <w:tc>
-          <w:tcPr>
-            <w:tcW w:w="3331" w:type="dxa"/>
-          </w:tcPr>
-          <w:p>
-            <w:pPr>
-              <w:rPr>
-                <w:lang w:val="es-ES"/>
-              </w:rPr>
-            </w:pPr>
-            <w:proofErr w:type="spellStart"/>
-            <w:r>
+              <w:t xml:space="preserve">Permite registrar las comidas consumidas detallando los carbohidratos netos (gramos) ingeridos, notas del </w:t>
+            </w:r>
+            <w:r>
+              <w:rPr>
+                <w:lang w:val="es-ES"/>
+              </w:rPr>
+              <w:lastRenderedPageBreak/>
+              <w:t>alimento y el momento de la ingesta para evaluar el impacto en la glucosa.</w:t>
+            </w:r>
+          </w:p>
+        </w:tc>
+      </w:tr>
+      <w:tr>
+        <w:tc>
+          <w:tcPr>
+            <w:tcW w:w="3331" w:type="dxa"/>
+          </w:tcPr>
+          <w:p>
+            <w:pPr>
+              <w:rPr>
+                <w:lang w:val="es-ES"/>
+              </w:rPr>
+            </w:pPr>
+            <w:proofErr w:type="spellStart"/>
+            <w:r>
+              <w:lastRenderedPageBreak/>
               <w:t>Precondiciones</w:t>
             </w:r>
             <w:proofErr w:type="spellEnd"/>
@@ -5485,7 +5494,6 @@
             </w:pPr>
             <w:proofErr w:type="spellStart"/>
             <w:r>
-              <w:lastRenderedPageBreak/>
               <w:t>Postcondiciones</w:t>
             </w:r>
             <w:proofErr w:type="spellEnd"/>
@@ -6442,6 +6450,7 @@
             </w:pPr>
             <w:proofErr w:type="spellStart"/>
             <w:r>
+              <w:lastRenderedPageBreak/>
               <w:t>Requerimientos</w:t>
             </w:r>
             <w:proofErr w:type="spellEnd"/>
@@ -6543,7 +6552,6 @@
         <w:rPr>
           <w:lang w:val="es-ES"/>
         </w:rPr>
-        <w:lastRenderedPageBreak/>
         <w:t>CU 07: Generar Análisis de Lecturas</w:t>
       </w:r>
       <w:bookmarkEnd w:id="10"/>
@@ -7470,6 +7478,7 @@
             </w:pPr>
             <w:proofErr w:type="spellStart"/>
             <w:r>
+              <w:lastRenderedPageBreak/>
               <w:t>Postcondiciones</w:t>
             </w:r>
             <w:proofErr w:type="spellEnd"/>
@@ -7650,7 +7659,6 @@
               </w:rPr>
             </w:pPr>
             <w:r>
-              <w:lastRenderedPageBreak/>
               <w:t>3</w:t>
             </w:r>
           </w:p>
@@ -8539,6 +8547,7 @@
             </w:pPr>
             <w:proofErr w:type="spellStart"/>
             <w:r>
+              <w:lastRenderedPageBreak/>
               <w:t>Requerimientos</w:t>
             </w:r>
             <w:proofErr w:type="spellEnd"/>
@@ -8720,7 +8729,6 @@
         <w:rPr>
           <w:lang w:val="es-ES"/>
         </w:rPr>
-        <w:lastRenderedPageBreak/>
         <w:t>CU 10: Visualizar Estadísticas (TIR)</w:t>
       </w:r>
       <w:bookmarkEnd w:id="13"/>
@@ -9712,6 +9720,7 @@
             </w:pPr>
             <w:proofErr w:type="spellStart"/>
             <w:r>
+              <w:lastRenderedPageBreak/>
               <w:t>Postcondiciones</w:t>
             </w:r>
             <w:proofErr w:type="spellEnd"/>
@@ -9892,7 +9901,6 @@
               </w:rPr>
             </w:pPr>
             <w:r>
-              <w:lastRenderedPageBreak/>
               <w:t>3</w:t>
             </w:r>
           </w:p>
@@ -10839,6 +10847,7 @@
             </w:pPr>
             <w:proofErr w:type="spellStart"/>
             <w:r>
+              <w:lastRenderedPageBreak/>
               <w:t>Prioridad</w:t>
             </w:r>
             <w:proofErr w:type="spellEnd"/>
@@ -11040,7 +11049,6 @@
             </w:pPr>
             <w:proofErr w:type="spellStart"/>
             <w:r>
-              <w:lastRenderedPageBreak/>
               <w:t>Descripción</w:t>
             </w:r>
             <w:proofErr w:type="spellEnd"/>
@@ -11585,8 +11593,8 @@
         <w:tblLook w:val="04A0" w:firstRow="1" w:lastRow="0" w:firstColumn="1" w:lastColumn="0" w:noHBand="0" w:noVBand="1"/>
       </w:tblPr>
       <w:tblGrid>
-        <w:gridCol w:w="3278"/>
-        <w:gridCol w:w="5314"/>
+        <w:gridCol w:w="3277"/>
+        <w:gridCol w:w="5315"/>
       </w:tblGrid>
       <w:tr>
         <w:tc>
@@ -11918,6 +11926,7 @@
               </w:rPr>
             </w:pPr>
             <w:r>
+              <w:lastRenderedPageBreak/>
               <w:t>2</w:t>
             </w:r>
           </w:p>
@@ -12041,7 +12050,6 @@
               <w:rPr>
                 <w:lang w:val="es-ES"/>
               </w:rPr>
-              <w:lastRenderedPageBreak/>
               <w:t>LocalStorage</w:t>
             </w:r>
             <w:proofErr w:type="spellEnd"/>
@@ -12081,7 +12089,6 @@
             </w:pPr>
             <w:proofErr w:type="spellStart"/>
             <w:r>
-              <w:lastRenderedPageBreak/>
               <w:t>Excepciones</w:t>
             </w:r>
             <w:proofErr w:type="spellEnd"/>
@@ -12186,7 +12193,19 @@
               <w:rPr>
                 <w:lang w:val="es-ES"/>
               </w:rPr>
-              <w:t>RF01 - Registro de usuarios, RF02 - Inicio de sesión</w:t>
+              <w:t>RF</w:t>
+            </w:r>
+            <w:r>
+              <w:rPr>
+                <w:lang w:val="es-ES"/>
+              </w:rPr>
+              <w:t xml:space="preserve">19 </w:t>
+            </w:r>
+            <w:r>
+              <w:rPr>
+                <w:lang w:val="es-ES"/>
+              </w:rPr>
+              <w:t>Recuperación de contraseña por correo</w:t>
             </w:r>
           </w:p>
         </w:tc>
@@ -12850,6 +12869,7 @@
               </w:rPr>
             </w:pPr>
             <w:r>
+              <w:lastRenderedPageBreak/>
               <w:t>4</w:t>
             </w:r>
           </w:p>
@@ -13046,7 +13066,6 @@
             </w:pPr>
             <w:proofErr w:type="spellStart"/>
             <w:r>
-              <w:lastRenderedPageBreak/>
               <w:t>Relaciones</w:t>
             </w:r>
             <w:proofErr w:type="spellEnd"/>
@@ -13961,6 +13980,7 @@
         <w:rPr>
           <w:lang w:val="es-ES"/>
         </w:rPr>
+        <w:lastRenderedPageBreak/>
         <w:t>CU 17: Análisis Predictivo Causal</w:t>
       </w:r>
       <w:bookmarkEnd w:id="20"/>
@@ -14193,7 +14213,6 @@
             </w:pPr>
             <w:proofErr w:type="spellStart"/>
             <w:r>
-              <w:lastRenderedPageBreak/>
               <w:t>Postcondiciones</w:t>
             </w:r>
             <w:proofErr w:type="spellEnd"/>
@@ -14896,6 +14915,7 @@
             </w:pPr>
             <w:proofErr w:type="spellStart"/>
             <w:r>
+              <w:lastRenderedPageBreak/>
               <w:t>Postcondiciones</w:t>
             </w:r>
             <w:proofErr w:type="spellEnd"/>
@@ -15157,31 +15177,23 @@
               <w:rPr>
                 <w:lang w:val="es-ES"/>
               </w:rPr>
-              <w:t xml:space="preserve"> envía la imagen a Gemini (modelo multimodal) solicitando extraer la pauta de insulina en </w:t>
-            </w:r>
-            <w:r>
-              <w:rPr>
-                <w:lang w:val="es-ES"/>
-              </w:rPr>
-              <w:lastRenderedPageBreak/>
-              <w:t>formato JSON estructurado.</w:t>
-            </w:r>
-          </w:p>
-        </w:tc>
-      </w:tr>
-      <w:tr>
-        <w:tc>
-          <w:tcPr>
-            <w:tcW w:w="3331" w:type="dxa"/>
-          </w:tcPr>
-          <w:p>
-            <w:pPr>
-              <w:rPr>
-                <w:lang w:val="es-ES"/>
-              </w:rPr>
-            </w:pPr>
-            <w:r>
-              <w:lastRenderedPageBreak/>
+              <w:t xml:space="preserve"> envía la imagen a Gemini (modelo multimodal) solicitando extraer la pauta de insulina en formato JSON estructurado.</w:t>
+            </w:r>
+          </w:p>
+        </w:tc>
+      </w:tr>
+      <w:tr>
+        <w:tc>
+          <w:tcPr>
+            <w:tcW w:w="3331" w:type="dxa"/>
+          </w:tcPr>
+          <w:p>
+            <w:pPr>
+              <w:rPr>
+                <w:lang w:val="es-ES"/>
+              </w:rPr>
+            </w:pPr>
+            <w:r>
               <w:t>5</w:t>
             </w:r>
           </w:p>
@@ -15805,6 +15817,7 @@
               </w:rPr>
             </w:pPr>
             <w:r>
+              <w:lastRenderedPageBreak/>
               <w:t>2</w:t>
             </w:r>
           </w:p>
@@ -16007,32 +16020,24 @@
               <w:rPr>
                 <w:lang w:val="es-ES"/>
               </w:rPr>
-              <w:t xml:space="preserve">: El sistema bloquea al administrador si intenta suspender su propia cuenta de </w:t>
-            </w:r>
-            <w:r>
-              <w:rPr>
-                <w:lang w:val="es-ES"/>
-              </w:rPr>
-              <w:lastRenderedPageBreak/>
-              <w:t>administrador.</w:t>
-            </w:r>
-          </w:p>
-        </w:tc>
-      </w:tr>
-      <w:tr>
-        <w:tc>
-          <w:tcPr>
-            <w:tcW w:w="3331" w:type="dxa"/>
-          </w:tcPr>
-          <w:p>
-            <w:pPr>
-              <w:rPr>
-                <w:lang w:val="es-ES"/>
-              </w:rPr>
-            </w:pPr>
-            <w:proofErr w:type="spellStart"/>
-            <w:r>
-              <w:lastRenderedPageBreak/>
+              <w:t>: El sistema bloquea al administrador si intenta suspender su propia cuenta de administrador.</w:t>
+            </w:r>
+          </w:p>
+        </w:tc>
+      </w:tr>
+      <w:tr>
+        <w:tc>
+          <w:tcPr>
+            <w:tcW w:w="3331" w:type="dxa"/>
+          </w:tcPr>
+          <w:p>
+            <w:pPr>
+              <w:rPr>
+                <w:lang w:val="es-ES"/>
+              </w:rPr>
+            </w:pPr>
+            <w:proofErr w:type="spellStart"/>
+            <w:r>
               <w:t>Requerimientos</w:t>
             </w:r>
             <w:proofErr w:type="spellEnd"/>
@@ -16739,6 +16744,7 @@
             </w:pPr>
             <w:proofErr w:type="spellStart"/>
             <w:r>
+              <w:lastRenderedPageBreak/>
               <w:t>Relaciones</w:t>
             </w:r>
             <w:proofErr w:type="spellEnd"/>
@@ -28886,6 +28892,8 @@
     <w:rsid w:val="000B10A2"/>
     <w:rsid w:val="003E1F97"/>
     <w:rsid w:val="0082635E"/>
+    <w:rsid w:val="008735C4"/>
+    <w:rsid w:val="009431CC"/>
     <w:rsid w:val="009A4B20"/>
     <w:rsid w:val="00A36EE9"/>
   </w:rsids>

</xml_diff>